<commit_message>
chore: eliminar archivo temporal de Word del repositorio
</commit_message>
<xml_diff>
--- a/docs/PadillaBelmonteLuisEnrique_InformeTecnico.docx
+++ b/docs/PadillaBelmonteLuisEnrique_InformeTecnico.docx
@@ -2795,6 +2795,12 @@
         <w:t>.</w:t>
       </w:r>
     </w:p>
+    <w:p/>
+    <w:p>
+      <w:pPr>
+        <w:ind w:firstLine="0"/>
+      </w:pPr>
+    </w:p>
     <w:p>
       <w:pPr>
         <w:pStyle w:val="Ttulo1"/>
@@ -7428,7 +7434,255 @@
     </w:p>
     <w:p>
       <w:r>
-        <w:t xml:space="preserve">Lorem ipsum dolor sit amet, at vivendo nostrum usu, lobortis mediocrem voluptatibus an sit. His eu mollis convenire dignissim, mei ea alia dicant, ignota latine rationibus sit ei. Quo expetenda maiestatis adversarium eu, ea sit modus tempor constituto. </w:t>
+        <w:t xml:space="preserve">Lorem </w:t>
+      </w:r>
+      <w:proofErr w:type="spellStart"/>
+      <w:r>
+        <w:t>ipsum</w:t>
+      </w:r>
+      <w:proofErr w:type="spellEnd"/>
+      <w:r>
+        <w:t xml:space="preserve"> dolor </w:t>
+      </w:r>
+      <w:proofErr w:type="spellStart"/>
+      <w:r>
+        <w:t>sit</w:t>
+      </w:r>
+      <w:proofErr w:type="spellEnd"/>
+      <w:r>
+        <w:t xml:space="preserve"> </w:t>
+      </w:r>
+      <w:proofErr w:type="spellStart"/>
+      <w:r>
+        <w:t>amet</w:t>
+      </w:r>
+      <w:proofErr w:type="spellEnd"/>
+      <w:r>
+        <w:t xml:space="preserve">, at </w:t>
+      </w:r>
+      <w:proofErr w:type="spellStart"/>
+      <w:r>
+        <w:t>vivendo</w:t>
+      </w:r>
+      <w:proofErr w:type="spellEnd"/>
+      <w:r>
+        <w:t xml:space="preserve"> </w:t>
+      </w:r>
+      <w:proofErr w:type="spellStart"/>
+      <w:r>
+        <w:t>nostrum</w:t>
+      </w:r>
+      <w:proofErr w:type="spellEnd"/>
+      <w:r>
+        <w:t xml:space="preserve"> </w:t>
+      </w:r>
+      <w:proofErr w:type="spellStart"/>
+      <w:r>
+        <w:t>usu</w:t>
+      </w:r>
+      <w:proofErr w:type="spellEnd"/>
+      <w:r>
+        <w:t xml:space="preserve">, </w:t>
+      </w:r>
+      <w:proofErr w:type="spellStart"/>
+      <w:r>
+        <w:t>lobortis</w:t>
+      </w:r>
+      <w:proofErr w:type="spellEnd"/>
+      <w:r>
+        <w:t xml:space="preserve"> </w:t>
+      </w:r>
+      <w:proofErr w:type="spellStart"/>
+      <w:r>
+        <w:t>mediocrem</w:t>
+      </w:r>
+      <w:proofErr w:type="spellEnd"/>
+      <w:r>
+        <w:t xml:space="preserve"> </w:t>
+      </w:r>
+      <w:proofErr w:type="spellStart"/>
+      <w:r>
+        <w:t>voluptatibus</w:t>
+      </w:r>
+      <w:proofErr w:type="spellEnd"/>
+      <w:r>
+        <w:t xml:space="preserve"> </w:t>
+      </w:r>
+      <w:proofErr w:type="spellStart"/>
+      <w:r>
+        <w:t>an</w:t>
+      </w:r>
+      <w:proofErr w:type="spellEnd"/>
+      <w:r>
+        <w:t xml:space="preserve"> </w:t>
+      </w:r>
+      <w:proofErr w:type="spellStart"/>
+      <w:r>
+        <w:t>sit</w:t>
+      </w:r>
+      <w:proofErr w:type="spellEnd"/>
+      <w:r>
+        <w:t xml:space="preserve">. </w:t>
+      </w:r>
+      <w:proofErr w:type="spellStart"/>
+      <w:r>
+        <w:t>His</w:t>
+      </w:r>
+      <w:proofErr w:type="spellEnd"/>
+      <w:r>
+        <w:t xml:space="preserve"> </w:t>
+      </w:r>
+      <w:proofErr w:type="spellStart"/>
+      <w:r>
+        <w:t>eu</w:t>
+      </w:r>
+      <w:proofErr w:type="spellEnd"/>
+      <w:r>
+        <w:t xml:space="preserve"> </w:t>
+      </w:r>
+      <w:proofErr w:type="spellStart"/>
+      <w:r>
+        <w:t>mollis</w:t>
+      </w:r>
+      <w:proofErr w:type="spellEnd"/>
+      <w:r>
+        <w:t xml:space="preserve"> </w:t>
+      </w:r>
+      <w:proofErr w:type="spellStart"/>
+      <w:r>
+        <w:t>convenire</w:t>
+      </w:r>
+      <w:proofErr w:type="spellEnd"/>
+      <w:r>
+        <w:t xml:space="preserve"> </w:t>
+      </w:r>
+      <w:proofErr w:type="spellStart"/>
+      <w:r>
+        <w:t>dignissim</w:t>
+      </w:r>
+      <w:proofErr w:type="spellEnd"/>
+      <w:r>
+        <w:t xml:space="preserve">, </w:t>
+      </w:r>
+      <w:proofErr w:type="spellStart"/>
+      <w:r>
+        <w:t>mei</w:t>
+      </w:r>
+      <w:proofErr w:type="spellEnd"/>
+      <w:r>
+        <w:t xml:space="preserve"> </w:t>
+      </w:r>
+      <w:proofErr w:type="spellStart"/>
+      <w:r>
+        <w:t>ea</w:t>
+      </w:r>
+      <w:proofErr w:type="spellEnd"/>
+      <w:r>
+        <w:t xml:space="preserve"> </w:t>
+      </w:r>
+      <w:proofErr w:type="spellStart"/>
+      <w:r>
+        <w:t>alia</w:t>
+      </w:r>
+      <w:proofErr w:type="spellEnd"/>
+      <w:r>
+        <w:t xml:space="preserve"> </w:t>
+      </w:r>
+      <w:proofErr w:type="spellStart"/>
+      <w:r>
+        <w:t>dicant</w:t>
+      </w:r>
+      <w:proofErr w:type="spellEnd"/>
+      <w:r>
+        <w:t xml:space="preserve">, ignota latine </w:t>
+      </w:r>
+      <w:proofErr w:type="spellStart"/>
+      <w:r>
+        <w:t>rationibus</w:t>
+      </w:r>
+      <w:proofErr w:type="spellEnd"/>
+      <w:r>
+        <w:t xml:space="preserve"> </w:t>
+      </w:r>
+      <w:proofErr w:type="spellStart"/>
+      <w:r>
+        <w:t>sit</w:t>
+      </w:r>
+      <w:proofErr w:type="spellEnd"/>
+      <w:r>
+        <w:t xml:space="preserve"> </w:t>
+      </w:r>
+      <w:proofErr w:type="spellStart"/>
+      <w:r>
+        <w:t>ei</w:t>
+      </w:r>
+      <w:proofErr w:type="spellEnd"/>
+      <w:r>
+        <w:t xml:space="preserve">. Quo </w:t>
+      </w:r>
+      <w:proofErr w:type="spellStart"/>
+      <w:r>
+        <w:t>expetenda</w:t>
+      </w:r>
+      <w:proofErr w:type="spellEnd"/>
+      <w:r>
+        <w:t xml:space="preserve"> </w:t>
+      </w:r>
+      <w:proofErr w:type="spellStart"/>
+      <w:r>
+        <w:t>maiestatis</w:t>
+      </w:r>
+      <w:proofErr w:type="spellEnd"/>
+      <w:r>
+        <w:t xml:space="preserve"> </w:t>
+      </w:r>
+      <w:proofErr w:type="spellStart"/>
+      <w:r>
+        <w:t>adversarium</w:t>
+      </w:r>
+      <w:proofErr w:type="spellEnd"/>
+      <w:r>
+        <w:t xml:space="preserve"> </w:t>
+      </w:r>
+      <w:proofErr w:type="spellStart"/>
+      <w:r>
+        <w:t>eu</w:t>
+      </w:r>
+      <w:proofErr w:type="spellEnd"/>
+      <w:r>
+        <w:t xml:space="preserve">, </w:t>
+      </w:r>
+      <w:proofErr w:type="spellStart"/>
+      <w:r>
+        <w:t>ea</w:t>
+      </w:r>
+      <w:proofErr w:type="spellEnd"/>
+      <w:r>
+        <w:t xml:space="preserve"> </w:t>
+      </w:r>
+      <w:proofErr w:type="spellStart"/>
+      <w:r>
+        <w:t>sit</w:t>
+      </w:r>
+      <w:proofErr w:type="spellEnd"/>
+      <w:r>
+        <w:t xml:space="preserve"> modus </w:t>
+      </w:r>
+      <w:proofErr w:type="spellStart"/>
+      <w:r>
+        <w:t>tempor</w:t>
+      </w:r>
+      <w:proofErr w:type="spellEnd"/>
+      <w:r>
+        <w:t xml:space="preserve"> </w:t>
+      </w:r>
+      <w:proofErr w:type="spellStart"/>
+      <w:r>
+        <w:t>constituto</w:t>
+      </w:r>
+      <w:proofErr w:type="spellEnd"/>
+      <w:r>
+        <w:t xml:space="preserve">. </w:t>
       </w:r>
       <w:r>
         <w:t xml:space="preserve">In </w:t>
@@ -7895,7 +8149,255 @@
     </w:p>
     <w:p>
       <w:r>
-        <w:t xml:space="preserve">Lorem ipsum dolor sit amet, at vivendo nostrum usu, lobortis mediocrem voluptatibus an sit. His eu mollis convenire dignissim, mei ea alia dicant, ignota latine rationibus sit ei. Quo expetenda maiestatis adversarium eu, ea sit modus tempor constituto. </w:t>
+        <w:t xml:space="preserve">Lorem </w:t>
+      </w:r>
+      <w:proofErr w:type="spellStart"/>
+      <w:r>
+        <w:t>ipsum</w:t>
+      </w:r>
+      <w:proofErr w:type="spellEnd"/>
+      <w:r>
+        <w:t xml:space="preserve"> dolor </w:t>
+      </w:r>
+      <w:proofErr w:type="spellStart"/>
+      <w:r>
+        <w:t>sit</w:t>
+      </w:r>
+      <w:proofErr w:type="spellEnd"/>
+      <w:r>
+        <w:t xml:space="preserve"> </w:t>
+      </w:r>
+      <w:proofErr w:type="spellStart"/>
+      <w:r>
+        <w:t>amet</w:t>
+      </w:r>
+      <w:proofErr w:type="spellEnd"/>
+      <w:r>
+        <w:t xml:space="preserve">, at </w:t>
+      </w:r>
+      <w:proofErr w:type="spellStart"/>
+      <w:r>
+        <w:t>vivendo</w:t>
+      </w:r>
+      <w:proofErr w:type="spellEnd"/>
+      <w:r>
+        <w:t xml:space="preserve"> </w:t>
+      </w:r>
+      <w:proofErr w:type="spellStart"/>
+      <w:r>
+        <w:t>nostrum</w:t>
+      </w:r>
+      <w:proofErr w:type="spellEnd"/>
+      <w:r>
+        <w:t xml:space="preserve"> </w:t>
+      </w:r>
+      <w:proofErr w:type="spellStart"/>
+      <w:r>
+        <w:t>usu</w:t>
+      </w:r>
+      <w:proofErr w:type="spellEnd"/>
+      <w:r>
+        <w:t xml:space="preserve">, </w:t>
+      </w:r>
+      <w:proofErr w:type="spellStart"/>
+      <w:r>
+        <w:t>lobortis</w:t>
+      </w:r>
+      <w:proofErr w:type="spellEnd"/>
+      <w:r>
+        <w:t xml:space="preserve"> </w:t>
+      </w:r>
+      <w:proofErr w:type="spellStart"/>
+      <w:r>
+        <w:t>mediocrem</w:t>
+      </w:r>
+      <w:proofErr w:type="spellEnd"/>
+      <w:r>
+        <w:t xml:space="preserve"> </w:t>
+      </w:r>
+      <w:proofErr w:type="spellStart"/>
+      <w:r>
+        <w:t>voluptatibus</w:t>
+      </w:r>
+      <w:proofErr w:type="spellEnd"/>
+      <w:r>
+        <w:t xml:space="preserve"> </w:t>
+      </w:r>
+      <w:proofErr w:type="spellStart"/>
+      <w:r>
+        <w:t>an</w:t>
+      </w:r>
+      <w:proofErr w:type="spellEnd"/>
+      <w:r>
+        <w:t xml:space="preserve"> </w:t>
+      </w:r>
+      <w:proofErr w:type="spellStart"/>
+      <w:r>
+        <w:t>sit</w:t>
+      </w:r>
+      <w:proofErr w:type="spellEnd"/>
+      <w:r>
+        <w:t xml:space="preserve">. </w:t>
+      </w:r>
+      <w:proofErr w:type="spellStart"/>
+      <w:r>
+        <w:t>His</w:t>
+      </w:r>
+      <w:proofErr w:type="spellEnd"/>
+      <w:r>
+        <w:t xml:space="preserve"> </w:t>
+      </w:r>
+      <w:proofErr w:type="spellStart"/>
+      <w:r>
+        <w:t>eu</w:t>
+      </w:r>
+      <w:proofErr w:type="spellEnd"/>
+      <w:r>
+        <w:t xml:space="preserve"> </w:t>
+      </w:r>
+      <w:proofErr w:type="spellStart"/>
+      <w:r>
+        <w:t>mollis</w:t>
+      </w:r>
+      <w:proofErr w:type="spellEnd"/>
+      <w:r>
+        <w:t xml:space="preserve"> </w:t>
+      </w:r>
+      <w:proofErr w:type="spellStart"/>
+      <w:r>
+        <w:t>convenire</w:t>
+      </w:r>
+      <w:proofErr w:type="spellEnd"/>
+      <w:r>
+        <w:t xml:space="preserve"> </w:t>
+      </w:r>
+      <w:proofErr w:type="spellStart"/>
+      <w:r>
+        <w:t>dignissim</w:t>
+      </w:r>
+      <w:proofErr w:type="spellEnd"/>
+      <w:r>
+        <w:t xml:space="preserve">, </w:t>
+      </w:r>
+      <w:proofErr w:type="spellStart"/>
+      <w:r>
+        <w:t>mei</w:t>
+      </w:r>
+      <w:proofErr w:type="spellEnd"/>
+      <w:r>
+        <w:t xml:space="preserve"> </w:t>
+      </w:r>
+      <w:proofErr w:type="spellStart"/>
+      <w:r>
+        <w:t>ea</w:t>
+      </w:r>
+      <w:proofErr w:type="spellEnd"/>
+      <w:r>
+        <w:t xml:space="preserve"> </w:t>
+      </w:r>
+      <w:proofErr w:type="spellStart"/>
+      <w:r>
+        <w:t>alia</w:t>
+      </w:r>
+      <w:proofErr w:type="spellEnd"/>
+      <w:r>
+        <w:t xml:space="preserve"> </w:t>
+      </w:r>
+      <w:proofErr w:type="spellStart"/>
+      <w:r>
+        <w:t>dicant</w:t>
+      </w:r>
+      <w:proofErr w:type="spellEnd"/>
+      <w:r>
+        <w:t xml:space="preserve">, ignota latine </w:t>
+      </w:r>
+      <w:proofErr w:type="spellStart"/>
+      <w:r>
+        <w:t>rationibus</w:t>
+      </w:r>
+      <w:proofErr w:type="spellEnd"/>
+      <w:r>
+        <w:t xml:space="preserve"> </w:t>
+      </w:r>
+      <w:proofErr w:type="spellStart"/>
+      <w:r>
+        <w:t>sit</w:t>
+      </w:r>
+      <w:proofErr w:type="spellEnd"/>
+      <w:r>
+        <w:t xml:space="preserve"> </w:t>
+      </w:r>
+      <w:proofErr w:type="spellStart"/>
+      <w:r>
+        <w:t>ei</w:t>
+      </w:r>
+      <w:proofErr w:type="spellEnd"/>
+      <w:r>
+        <w:t xml:space="preserve">. Quo </w:t>
+      </w:r>
+      <w:proofErr w:type="spellStart"/>
+      <w:r>
+        <w:t>expetenda</w:t>
+      </w:r>
+      <w:proofErr w:type="spellEnd"/>
+      <w:r>
+        <w:t xml:space="preserve"> </w:t>
+      </w:r>
+      <w:proofErr w:type="spellStart"/>
+      <w:r>
+        <w:t>maiestatis</w:t>
+      </w:r>
+      <w:proofErr w:type="spellEnd"/>
+      <w:r>
+        <w:t xml:space="preserve"> </w:t>
+      </w:r>
+      <w:proofErr w:type="spellStart"/>
+      <w:r>
+        <w:t>adversarium</w:t>
+      </w:r>
+      <w:proofErr w:type="spellEnd"/>
+      <w:r>
+        <w:t xml:space="preserve"> </w:t>
+      </w:r>
+      <w:proofErr w:type="spellStart"/>
+      <w:r>
+        <w:t>eu</w:t>
+      </w:r>
+      <w:proofErr w:type="spellEnd"/>
+      <w:r>
+        <w:t xml:space="preserve">, </w:t>
+      </w:r>
+      <w:proofErr w:type="spellStart"/>
+      <w:r>
+        <w:t>ea</w:t>
+      </w:r>
+      <w:proofErr w:type="spellEnd"/>
+      <w:r>
+        <w:t xml:space="preserve"> </w:t>
+      </w:r>
+      <w:proofErr w:type="spellStart"/>
+      <w:r>
+        <w:t>sit</w:t>
+      </w:r>
+      <w:proofErr w:type="spellEnd"/>
+      <w:r>
+        <w:t xml:space="preserve"> modus </w:t>
+      </w:r>
+      <w:proofErr w:type="spellStart"/>
+      <w:r>
+        <w:t>tempor</w:t>
+      </w:r>
+      <w:proofErr w:type="spellEnd"/>
+      <w:r>
+        <w:t xml:space="preserve"> </w:t>
+      </w:r>
+      <w:proofErr w:type="spellStart"/>
+      <w:r>
+        <w:t>constituto</w:t>
+      </w:r>
+      <w:proofErr w:type="spellEnd"/>
+      <w:r>
+        <w:t xml:space="preserve">. </w:t>
       </w:r>
       <w:r>
         <w:t xml:space="preserve">In </w:t>
@@ -17837,7 +18339,6 @@
   <w:style w:type="character" w:default="1" w:styleId="Fuentedeprrafopredeter">
     <w:name w:val="Default Paragraph Font"/>
     <w:uiPriority w:val="1"/>
-    <w:semiHidden/>
     <w:unhideWhenUsed/>
   </w:style>
   <w:style w:type="table" w:default="1" w:styleId="Tablanormal">

</xml_diff>

<commit_message>
docs: actualizacio informe tecnico
</commit_message>
<xml_diff>
--- a/docs/PadillaBelmonteLuisEnrique_InformeTecnico.docx
+++ b/docs/PadillaBelmonteLuisEnrique_InformeTecnico.docx
@@ -2056,11 +2056,189 @@
       <w:pPr>
         <w:pStyle w:val="Ttulo2"/>
       </w:pPr>
-      <w:bookmarkStart w:id="4" w:name="_Toc228530803"/>
-      <w:r>
-        <w:t>Descripción general del proceso FDM y fuentes de emisión</w:t>
-      </w:r>
-      <w:bookmarkEnd w:id="4"/>
+      <w:r>
+        <w:t>Ausencia de protección de concurrencia</w:t>
+      </w:r>
+    </w:p>
+    <w:p>
+      <w:r>
+        <w:rPr>
+          <w:lang w:val="en-GB"/>
+        </w:rPr>
+        <w:t xml:space="preserve">Lorem ipsum dolor sit amet, at vivendo nostrum usu, lobortis mediocrem voluptatibus an sit. </w:t>
+      </w:r>
+      <w:r>
+        <w:t xml:space="preserve">His eu mollis convenire dignissim, mei ea alia dicant, ignota latine rationibus sit ei. Quo expetenda maiestatis adversarium eu, ea sit modus tempor constituto. </w:t>
+      </w:r>
+      <w:r>
+        <w:t>In atqui mazim luptatum sea, te nec verear inimicus. No sit nostro verterem, pertinax recteque no est, ex duo errem nobis.</w:t>
+      </w:r>
+    </w:p>
+    <w:p>
+      <w:r>
+        <w:t>Quo ut detracto definitiones, cu sonet homero has, ius amet omittam percipitur no. Antiopam repudiandae et pri, quaeque consetetur no eos, et sale nulla splendide sit. Pri ad tantas conclusionemque, has eligendi apeirian delicata ex, ut eos aeque sonet debitis. Mundi recusabo vis at, case pericula duo ei. Illud intellegam eloquentiam eam ad, partem suavitate pertinacia sed ex, in epicurei probatus pericula nec.</w:t>
+      </w:r>
+    </w:p>
+    <w:p>
+      <w:r>
+        <w:t xml:space="preserve">Ius in tamquam ceteros, pri te dicat convenire urbanitas. </w:t>
+      </w:r>
+      <w:r>
+        <w:rPr>
+          <w:lang w:val="en-US"/>
+        </w:rPr>
+        <w:t xml:space="preserve">An nec mucius efficiendi, ei mel senserit prodesset deseruisse. </w:t>
+      </w:r>
+      <w:r>
+        <w:t>Elit quando sea te, vix omnes possim option ex. Pro an duis tibique definitionem, quod error dolorum et mel. Putent discere eam ei. Sed eu dolore petentium.</w:t>
+      </w:r>
+    </w:p>
+    <w:p>
+      <w:pPr>
+        <w:rPr>
+          <w:lang w:val="en-US"/>
+        </w:rPr>
+      </w:pPr>
+      <w:r>
+        <w:t xml:space="preserve">Has id errem quando, justo noster euismod ex vix. Dicant animal officiis eu nec, te oblique feugiat usu, nam te iusto graeco blandit. </w:t>
+      </w:r>
+      <w:r>
+        <w:rPr>
+          <w:lang w:val="en-US"/>
+        </w:rPr>
+        <w:t>Cu ignota comprehensam mel. Et eum denique temporibus, nam amet gubergren eu. Cu his sanctus evertitur, pro epicurei lobortis laboramus ea. Tollit inermis dignissim cum ne.</w:t>
+      </w:r>
+    </w:p>
+    <w:p>
+      <w:pPr>
+        <w:rPr>
+          <w:lang w:val="en-GB"/>
+        </w:rPr>
+      </w:pPr>
+      <w:r>
+        <w:rPr>
+          <w:lang w:val="en-US"/>
+        </w:rPr>
+        <w:t xml:space="preserve">Eu vel elit brute definitiones, dicant consequat mei ea, ridens eleifend usu te. Cum dicam laoreet in, eos et postea diceret albucius. </w:t>
+      </w:r>
+      <w:r>
+        <w:rPr>
+          <w:lang w:val="en-GB"/>
+        </w:rPr>
+        <w:t>Populo facete fabellas ne per, ea numquam invidunt maluisset est, habemus tacimates at vim. Id nonumy accommodare sea. Noster nominati ne nam, pri at minimum reformidans.</w:t>
+      </w:r>
+    </w:p>
+    <w:p>
+      <w:pPr>
+        <w:pStyle w:val="Ttulo2"/>
+        <w:rPr>
+          <w:bCs/>
+        </w:rPr>
+      </w:pPr>
+      <w:r>
+        <w:rPr>
+          <w:bCs/>
+        </w:rPr>
+        <w:t>Falta de validación de parámetros en funciones públicas</w:t>
+      </w:r>
+    </w:p>
+    <w:p>
+      <w:r>
+        <w:rPr>
+          <w:lang w:val="en-GB"/>
+        </w:rPr>
+        <w:t xml:space="preserve">Lorem ipsum dolor sit amet, at vivendo nostrum usu, lobortis mediocrem voluptatibus an sit. His eu mollis convenire dignissim, mei ea alia dicant, ignota latine rationibus sit ei. Quo expetenda maiestatis adversarium eu, ea sit modus tempor constituto. </w:t>
+      </w:r>
+      <w:r>
+        <w:t>In atqui mazim luptatum sea, te nec verear inimicus. No sit nostro verterem, pertinax recteque no est, ex duo errem nobis.</w:t>
+      </w:r>
+    </w:p>
+    <w:p>
+      <w:r>
+        <w:t>Quo ut detracto definitiones, cu sonet homero has, ius amet omittam percipitur no. Antiopam repudiandae et pri, quaeque consetetur no eos, et sale nulla splendide sit. Pri ad tantas conclusionemque, has eligendi apeirian delicata ex, ut eos aeque sonet debitis. Mundi recusabo vis at, case pericula duo ei. Illud intellegam eloquentiam eam ad, partem suavitate pertinacia sed ex, in epicurei probatus pericula nec.</w:t>
+      </w:r>
+    </w:p>
+    <w:p>
+      <w:r>
+        <w:t xml:space="preserve">Ius in tamquam ceteros, pri te dicat convenire urbanitas. </w:t>
+      </w:r>
+      <w:r>
+        <w:rPr>
+          <w:lang w:val="en-GB"/>
+        </w:rPr>
+        <w:t xml:space="preserve">An nec mucius efficiendi, ei mel senserit prodesset deseruisse. </w:t>
+      </w:r>
+      <w:r>
+        <w:t>Elit quando sea te, vix omnes possim option ex. Pro an duis tibique definitionem, quod error dolorum et mel. Putent discere eam ei. Sed eu dolore petentium.</w:t>
+      </w:r>
+    </w:p>
+    <w:p>
+      <w:pPr>
+        <w:rPr>
+          <w:lang w:val="en-GB"/>
+        </w:rPr>
+      </w:pPr>
+      <w:r>
+        <w:t xml:space="preserve">Has id errem quando, justo noster euismod ex vix. Dicant animal officiis eu nec, te oblique feugiat usu, nam te iusto graeco blandit. </w:t>
+      </w:r>
+      <w:r>
+        <w:rPr>
+          <w:lang w:val="en-GB"/>
+        </w:rPr>
+        <w:t>Cu ignota comprehensam mel. Et eum denique temporibus, nam amet gubergren eu. Cu his sanctus evertitur, pro epicurei lobortis laboramus ea. Tollit inermis dignissim cum ne.</w:t>
+      </w:r>
+    </w:p>
+    <w:p>
+      <w:pPr>
+        <w:rPr>
+          <w:lang w:val="en-GB"/>
+        </w:rPr>
+      </w:pPr>
+      <w:r>
+        <w:rPr>
+          <w:lang w:val="en-GB"/>
+        </w:rPr>
+        <w:t>Eu vel elit brute definitiones, dicant consequat mei ea, ridens eleifend usu te. Cum dicam laoreet in, eos et postea diceret albucius. Populo facete fabellas ne per, ea numquam invidunt maluisset est, habemus tacimates at vim. Id nonumy accommodare sea. Noster nominati ne nam, pri at minimum reformidans.</w:t>
+      </w:r>
+    </w:p>
+    <w:p>
+      <w:pPr>
+        <w:pStyle w:val="Ttulo2"/>
+      </w:pPr>
+      <w:r>
+        <w:t>Comunicación deficiente de errores</w:t>
+      </w:r>
+    </w:p>
+    <w:p>
+      <w:r>
+        <w:rPr>
+          <w:lang w:val="en-GB"/>
+        </w:rPr>
+        <w:t xml:space="preserve">Lorem ipsum dolor sit amet, at vivendo nostrum usu, lobortis mediocrem voluptatibus an sit. His eu mollis convenire dignissim, mei ea alia dicant, ignota latine rationibus sit ei. Quo expetenda maiestatis adversarium eu, ea sit modus tempor constituto. </w:t>
+      </w:r>
+      <w:r>
+        <w:t>In atqui mazim luptatum sea, te nec verear inimicus. No sit nostro verterem, pertinax recteque no est, ex duo errem nobis.</w:t>
+      </w:r>
+    </w:p>
+    <w:p>
+      <w:r>
+        <w:t>Quo ut detracto definitiones, cu sonet homero has, ius amet omittam percipitur no. Antiopam repudiandae et pri, quaeque consetetur no eos, et sale nulla splendide sit. Pri ad tantas conclusionemque, has eligendi apeirian delicata ex, ut eos aeque sonet debitis. Mundi recusabo vis at, case pericula duo ei. Illud intellegam eloquentiam eam ad, partem suavitate pertinacia sed ex, in epicurei probatus pericula nec.</w:t>
+      </w:r>
+    </w:p>
+    <w:p>
+      <w:pPr>
+        <w:pStyle w:val="Ttulo2"/>
+        <w:rPr>
+          <w:bCs/>
+        </w:rPr>
+      </w:pPr>
+      <w:r>
+        <w:rPr>
+          <w:bCs/>
+        </w:rPr>
+        <w:lastRenderedPageBreak/>
+        <w:t>Inicialización inconsistente de variables</w:t>
+      </w:r>
     </w:p>
     <w:p>
       <w:pPr>
@@ -2070,14 +2248,11 @@
           <w:numId w:val="0"/>
         </w:numPr>
       </w:pPr>
-      <w:bookmarkStart w:id="5" w:name="_Toc228530804"/>
-      <w:r>
-        <w:t xml:space="preserve">Clasificación </w:t>
-      </w:r>
-      <w:r>
-        <w:t>de contaminantes emitidos</w:t>
-      </w:r>
-      <w:bookmarkEnd w:id="5"/>
+      <w:bookmarkStart w:id="4" w:name="_Toc228530810"/>
+      <w:r>
+        <w:t>Ventilación natural y forzada</w:t>
+      </w:r>
+      <w:bookmarkEnd w:id="4"/>
     </w:p>
     <w:p>
       <w:r>
@@ -2093,55 +2268,6 @@
       </w:r>
     </w:p>
     <w:p>
-      <w:r>
-        <w:t xml:space="preserve">Ius in tamquam ceteros, pri te dicat convenire urbanitas. </w:t>
-      </w:r>
-      <w:r>
-        <w:rPr>
-          <w:lang w:val="en-US"/>
-        </w:rPr>
-        <w:t xml:space="preserve">An nec mucius efficiendi, ei mel senserit prodesset deseruisse. </w:t>
-      </w:r>
-      <w:r>
-        <w:t>Elit quando sea te, vix omnes possim option ex. Pro an duis tibique definitionem, quod error dolorum et mel. Putent discere eam ei. Sed eu dolore petentium.</w:t>
-      </w:r>
-    </w:p>
-    <w:p>
-      <w:pPr>
-        <w:rPr>
-          <w:lang w:val="en-US"/>
-        </w:rPr>
-      </w:pPr>
-      <w:r>
-        <w:t xml:space="preserve">Has id errem quando, justo noster euismod ex vix. Dicant animal officiis eu nec, te oblique feugiat usu, nam te iusto graeco blandit. </w:t>
-      </w:r>
-      <w:r>
-        <w:rPr>
-          <w:lang w:val="en-US"/>
-        </w:rPr>
-        <w:t>Cu ignota comprehensam mel. Et eum denique temporibus, nam amet gubergren eu. Cu his sanctus evertitur, pro epicurei lobortis laboramus ea. Tollit inermis dignissim cum ne.</w:t>
-      </w:r>
-    </w:p>
-    <w:p>
-      <w:pPr>
-        <w:rPr>
-          <w:lang w:val="en-GB"/>
-        </w:rPr>
-      </w:pPr>
-      <w:r>
-        <w:rPr>
-          <w:lang w:val="en-US"/>
-        </w:rPr>
-        <w:t xml:space="preserve">Eu vel elit brute definitiones, dicant consequat mei ea, ridens eleifend usu te. Cum dicam laoreet in, eos et postea diceret albucius. </w:t>
-      </w:r>
-      <w:r>
-        <w:rPr>
-          <w:lang w:val="en-GB"/>
-        </w:rPr>
-        <w:t>Populo facete fabellas ne per, ea numquam invidunt maluisset est, habemus tacimates at vim. Id nonumy accommodare sea. Noster nominati ne nam, pri at minimum reformidans.</w:t>
-      </w:r>
-    </w:p>
-    <w:p>
       <w:pPr>
         <w:pStyle w:val="Ttulo2"/>
         <w:rPr>
@@ -2150,45 +2276,13 @@
       </w:pPr>
       <w:r>
         <w:rPr>
-          <w:lang w:val="en-GB"/>
-        </w:rPr>
-        <w:t> </w:t>
-      </w:r>
-      <w:r>
-        <w:rPr>
           <w:bCs/>
-          <w:lang w:val="en-GB"/>
-        </w:rPr>
-        <w:t> </w:t>
-      </w:r>
-      <w:bookmarkStart w:id="6" w:name="_Toc228530805"/>
-      <w:r>
-        <w:rPr>
-          <w:bCs/>
-        </w:rPr>
-        <w:t>Dinámica temporal de las emisiones</w:t>
-      </w:r>
-      <w:bookmarkEnd w:id="6"/>
-    </w:p>
-    <w:p>
-      <w:pPr>
-        <w:pStyle w:val="Ttulo3"/>
-        <w:numPr>
-          <w:ilvl w:val="0"/>
-          <w:numId w:val="0"/>
-        </w:numPr>
-      </w:pPr>
-      <w:bookmarkStart w:id="7" w:name="_Toc228530806"/>
-      <w:r>
-        <w:t>Fases típicas de emisión durante un ciclo de impresión</w:t>
-      </w:r>
-      <w:bookmarkEnd w:id="7"/>
-    </w:p>
-    <w:p>
-      <w:r>
-        <w:rPr>
-          <w:lang w:val="en-GB"/>
-        </w:rPr>
+        </w:rPr>
+        <w:t>Uso de funciones inseguras de C estándar</w:t>
+      </w:r>
+    </w:p>
+    <w:p>
+      <w:r>
         <w:t xml:space="preserve">Lorem ipsum dolor sit amet, at vivendo nostrum usu, lobortis mediocrem voluptatibus an sit. His eu mollis convenire dignissim, mei ea alia dicant, ignota latine rationibus sit ei. Quo expetenda maiestatis adversarium eu, ea sit modus tempor constituto. </w:t>
       </w:r>
       <w:r>
@@ -2201,185 +2295,15 @@
       </w:r>
     </w:p>
     <w:p>
-      <w:r>
-        <w:t xml:space="preserve">Ius in tamquam ceteros, pri te dicat convenire urbanitas. </w:t>
-      </w:r>
-      <w:r>
-        <w:rPr>
-          <w:lang w:val="en-GB"/>
-        </w:rPr>
-        <w:t xml:space="preserve">An nec mucius efficiendi, ei mel senserit prodesset deseruisse. </w:t>
-      </w:r>
-      <w:r>
-        <w:t>Elit quando sea te, vix omnes possim option ex. Pro an duis tibique definitionem, quod error dolorum et mel. Putent discere eam ei. Sed eu dolore petentium.</w:t>
-      </w:r>
-    </w:p>
-    <w:p>
-      <w:pPr>
-        <w:rPr>
-          <w:lang w:val="en-GB"/>
-        </w:rPr>
-      </w:pPr>
-      <w:r>
-        <w:t xml:space="preserve">Has id errem quando, justo noster euismod ex vix. Dicant animal officiis eu nec, te oblique feugiat usu, nam te iusto graeco blandit. </w:t>
-      </w:r>
-      <w:r>
-        <w:rPr>
-          <w:lang w:val="en-GB"/>
-        </w:rPr>
-        <w:t>Cu ignota comprehensam mel. Et eum denique temporibus, nam amet gubergren eu. Cu his sanctus evertitur, pro epicurei lobortis laboramus ea. Tollit inermis dignissim cum ne.</w:t>
-      </w:r>
-    </w:p>
-    <w:p>
-      <w:pPr>
-        <w:rPr>
-          <w:lang w:val="en-GB"/>
-        </w:rPr>
-      </w:pPr>
-      <w:r>
-        <w:rPr>
-          <w:lang w:val="en-GB"/>
-        </w:rPr>
-        <w:t>Eu vel elit brute definitiones, dicant consequat mei ea, ridens eleifend usu te. Cum dicam laoreet in, eos et postea diceret albucius. Populo facete fabellas ne per, ea numquam invidunt maluisset est, habemus tacimates at vim. Id nonumy accommodare sea. Noster nominati ne nam, pri at minimum reformidans.</w:t>
-      </w:r>
-    </w:p>
-    <w:p>
-      <w:pPr>
-        <w:pStyle w:val="Ttulo2"/>
-      </w:pPr>
-      <w:bookmarkStart w:id="8" w:name="_Toc228530807"/>
-      <w:r>
-        <w:t>Implicaciones toxicológicas y criterios de riesgo</w:t>
-      </w:r>
-      <w:bookmarkEnd w:id="8"/>
-    </w:p>
-    <w:p>
-      <w:pPr>
-        <w:pStyle w:val="Ttulo3"/>
-        <w:numPr>
-          <w:ilvl w:val="0"/>
-          <w:numId w:val="0"/>
-        </w:numPr>
-      </w:pPr>
-      <w:bookmarkStart w:id="9" w:name="_Toc228530808"/>
-      <w:r>
-        <w:t>Relevancia sanitaria de las partículas ultrafinas</w:t>
-      </w:r>
-      <w:bookmarkEnd w:id="9"/>
-    </w:p>
-    <w:p>
-      <w:r>
-        <w:rPr>
-          <w:lang w:val="en-GB"/>
-        </w:rPr>
-        <w:t xml:space="preserve">Lorem ipsum dolor sit amet, at vivendo nostrum usu, lobortis mediocrem voluptatibus an sit. His eu mollis convenire dignissim, mei ea alia dicant, ignota latine rationibus sit ei. Quo expetenda maiestatis adversarium eu, ea sit modus tempor constituto. </w:t>
-      </w:r>
-      <w:r>
-        <w:t>In atqui mazim luptatum sea, te nec verear inimicus. No sit nostro verterem, pertinax recteque no est, ex duo errem nobis.</w:t>
-      </w:r>
-    </w:p>
-    <w:p>
-      <w:r>
-        <w:lastRenderedPageBreak/>
-        <w:t>Quo ut detracto definitiones, cu sonet homero has, ius amet omittam percipitur no. Antiopam repudiandae et pri, quaeque consetetur no eos, et sale nulla splendide sit. Pri ad tantas conclusionemque, has eligendi apeirian delicata ex, ut eos aeque sonet debitis. Mundi recusabo vis at, case pericula duo ei. Illud intellegam eloquentiam eam ad, partem suavitate pertinacia sed ex, in epicurei probatus pericula nec.</w:t>
-      </w:r>
-    </w:p>
-    <w:p>
-      <w:pPr>
-        <w:pStyle w:val="Ttulo2"/>
-        <w:rPr>
-          <w:bCs/>
-        </w:rPr>
-      </w:pPr>
-      <w:bookmarkStart w:id="10" w:name="_Toc228530809"/>
-      <w:r>
-        <w:rPr>
-          <w:bCs/>
-        </w:rPr>
-        <w:t>Estrategias de mitigación estudiadas en la literatura</w:t>
-      </w:r>
-      <w:bookmarkEnd w:id="10"/>
-    </w:p>
-    <w:p>
-      <w:pPr>
-        <w:pStyle w:val="Ttulo3"/>
-        <w:numPr>
-          <w:ilvl w:val="0"/>
-          <w:numId w:val="0"/>
-        </w:numPr>
-      </w:pPr>
-      <w:bookmarkStart w:id="11" w:name="_Toc228530810"/>
-      <w:r>
-        <w:t>Ventilación natural y forzada</w:t>
-      </w:r>
-      <w:bookmarkEnd w:id="11"/>
-    </w:p>
-    <w:p>
-      <w:r>
-        <w:t xml:space="preserve">Lorem ipsum dolor sit amet, at vivendo nostrum usu, lobortis mediocrem voluptatibus an sit. His eu mollis convenire dignissim, mei ea alia dicant, ignota latine rationibus sit ei. Quo expetenda maiestatis adversarium eu, ea sit modus tempor constituto. </w:t>
-      </w:r>
-      <w:r>
-        <w:t>In atqui mazim luptatum sea, te nec verear inimicus. No sit nostro verterem, pertinax recteque no est, ex duo errem nobis.</w:t>
-      </w:r>
-    </w:p>
-    <w:p>
-      <w:r>
-        <w:t>Quo ut detracto definitiones, cu sonet homero has, ius amet omittam percipitur no. Antiopam repudiandae et pri, quaeque consetetur no eos, et sale nulla splendide sit. Pri ad tantas conclusionemque, has eligendi apeirian delicata ex, ut eos aeque sonet debitis. Mundi recusabo vis at, case pericula duo ei. Illud intellegam eloquentiam eam ad, partem suavitate pertinacia sed ex, in epicurei probatus pericula nec.</w:t>
-      </w:r>
-    </w:p>
-    <w:p>
-      <w:pPr>
-        <w:pStyle w:val="Ttulo2"/>
-        <w:rPr>
-          <w:bCs/>
-        </w:rPr>
-      </w:pPr>
-      <w:bookmarkStart w:id="12" w:name="_Toc228530811"/>
-      <w:r>
-        <w:rPr>
-          <w:bCs/>
-        </w:rPr>
-        <w:t>Sistemas de monitorización de emisiones en FDM</w:t>
-      </w:r>
-      <w:bookmarkEnd w:id="12"/>
-    </w:p>
-    <w:p>
-      <w:pPr>
-        <w:pStyle w:val="Ttulo3"/>
-        <w:numPr>
-          <w:ilvl w:val="0"/>
-          <w:numId w:val="0"/>
-        </w:numPr>
-      </w:pPr>
-      <w:bookmarkStart w:id="13" w:name="_Toc228530812"/>
-      <w:r>
-        <w:t>Instrumentación científica de referencia</w:t>
-      </w:r>
-      <w:bookmarkEnd w:id="13"/>
-    </w:p>
-    <w:p>
-      <w:r>
-        <w:t xml:space="preserve">Lorem ipsum dolor sit amet, at vivendo nostrum usu, lobortis mediocrem voluptatibus an sit. His eu mollis convenire dignissim, mei ea alia dicant, ignota latine rationibus sit ei. Quo expetenda maiestatis adversarium eu, ea sit modus tempor constituto. </w:t>
-      </w:r>
-      <w:r>
-        <w:t>In atqui mazim luptatum sea, te nec verear inimicus. No sit nostro verterem, pertinax recteque no est, ex duo errem nobis.</w:t>
-      </w:r>
-    </w:p>
-    <w:p>
-      <w:r>
-        <w:t>Quo ut detracto definitiones, cu sonet homero has, ius amet omittam percipitur no. Antiopam repudiandae et pri, quaeque consetetur no eos, et sale nulla splendide sit. Pri ad tantas conclusionemque, has eligendi apeirian delicata ex, ut eos aeque sonet debitis. Mundi recusabo vis at, case pericula duo ei. Illud intellegam eloquentiam eam ad, partem suavitate pertinacia sed ex, in epicurei probatus pericula nec.</w:t>
-      </w:r>
-    </w:p>
-    <w:p>
       <w:pPr>
         <w:pStyle w:val="Ttulo1"/>
       </w:pPr>
-      <w:bookmarkStart w:id="14" w:name="_Toc228530813"/>
+      <w:bookmarkStart w:id="5" w:name="_Toc228530813"/>
       <w:r>
         <w:lastRenderedPageBreak/>
         <w:t>Hallazgos puntuales destacados</w:t>
       </w:r>
-      <w:bookmarkEnd w:id="14"/>
+      <w:bookmarkEnd w:id="5"/>
     </w:p>
     <w:p>
       <w:r>
@@ -2440,7 +2364,7 @@
           <w:bCs/>
         </w:rPr>
       </w:pPr>
-      <w:bookmarkStart w:id="15" w:name="_Toc228530814"/>
+      <w:bookmarkStart w:id="6" w:name="_Toc228530814"/>
       <w:r>
         <w:rPr>
           <w:bCs/>
@@ -2448,17 +2372,17 @@
         <w:lastRenderedPageBreak/>
         <w:t>Análisis de integridad mediante CRC</w:t>
       </w:r>
-      <w:bookmarkEnd w:id="15"/>
+      <w:bookmarkEnd w:id="6"/>
     </w:p>
     <w:p>
       <w:pPr>
         <w:pStyle w:val="Ttulo2"/>
       </w:pPr>
-      <w:bookmarkStart w:id="16" w:name="_Toc228530815"/>
+      <w:bookmarkStart w:id="7" w:name="_Toc228530815"/>
       <w:r>
         <w:t>Planteamiento</w:t>
       </w:r>
-      <w:bookmarkEnd w:id="16"/>
+      <w:bookmarkEnd w:id="7"/>
     </w:p>
     <w:p>
       <w:r>
@@ -2480,11 +2404,11 @@
       <w:pPr>
         <w:pStyle w:val="Ttulo2"/>
       </w:pPr>
-      <w:bookmarkStart w:id="17" w:name="_Toc228530816"/>
+      <w:bookmarkStart w:id="8" w:name="_Toc228530816"/>
       <w:r>
         <w:t>Diseño de la vista determinista</w:t>
       </w:r>
-      <w:bookmarkEnd w:id="17"/>
+      <w:bookmarkEnd w:id="8"/>
     </w:p>
     <w:p>
       <w:r>
@@ -2506,11 +2430,11 @@
       <w:pPr>
         <w:pStyle w:val="Ttulo2"/>
       </w:pPr>
-      <w:bookmarkStart w:id="18" w:name="_Toc228530817"/>
+      <w:bookmarkStart w:id="9" w:name="_Toc228530817"/>
       <w:r>
         <w:t>Defectos en la implementación actual</w:t>
       </w:r>
-      <w:bookmarkEnd w:id="18"/>
+      <w:bookmarkEnd w:id="9"/>
     </w:p>
     <w:p>
       <w:r>
@@ -2532,11 +2456,11 @@
       <w:pPr>
         <w:pStyle w:val="Ttulo2"/>
       </w:pPr>
-      <w:bookmarkStart w:id="19" w:name="_Toc228530818"/>
+      <w:bookmarkStart w:id="10" w:name="_Toc228530818"/>
       <w:r>
         <w:t>Violaciones que invalidan el CRC</w:t>
       </w:r>
-      <w:bookmarkEnd w:id="19"/>
+      <w:bookmarkEnd w:id="10"/>
     </w:p>
     <w:p>
       <w:r>
@@ -2558,18 +2482,21 @@
       <w:pPr>
         <w:pStyle w:val="Ttulo2"/>
       </w:pPr>
-      <w:bookmarkStart w:id="20" w:name="_Toc228530819"/>
+      <w:bookmarkStart w:id="11" w:name="_Toc228530819"/>
       <w:r>
         <w:lastRenderedPageBreak/>
         <w:t>Implementación corregida</w:t>
       </w:r>
-      <w:bookmarkEnd w:id="20"/>
+      <w:bookmarkEnd w:id="11"/>
     </w:p>
     <w:p>
       <w:pPr>
         <w:ind w:firstLine="0"/>
       </w:pPr>
       <w:r>
+        <w:rPr>
+          <w:noProof/>
+        </w:rPr>
         <w:drawing>
           <wp:inline distT="0" distB="0" distL="0" distR="0" wp14:anchorId="6AEE2165" wp14:editId="126BB1F4">
             <wp:extent cx="5939790" cy="2257425"/>
@@ -2611,22 +2538,22 @@
       <w:pPr>
         <w:pStyle w:val="Ttulo1"/>
       </w:pPr>
-      <w:bookmarkStart w:id="21" w:name="_Toc228530820"/>
+      <w:bookmarkStart w:id="12" w:name="_Toc228530820"/>
       <w:r>
         <w:lastRenderedPageBreak/>
         <w:t>Correcciones aplicadas y desviaciones</w:t>
       </w:r>
-      <w:bookmarkEnd w:id="21"/>
+      <w:bookmarkEnd w:id="12"/>
     </w:p>
     <w:p>
       <w:pPr>
         <w:pStyle w:val="Ttulo2"/>
       </w:pPr>
-      <w:bookmarkStart w:id="22" w:name="_Toc228530821"/>
+      <w:bookmarkStart w:id="13" w:name="_Toc228530821"/>
       <w:r>
         <w:t>Correcciones implementadas</w:t>
       </w:r>
-      <w:bookmarkEnd w:id="22"/>
+      <w:bookmarkEnd w:id="13"/>
     </w:p>
     <w:p>
       <w:r>
@@ -2648,11 +2575,11 @@
       <w:pPr>
         <w:pStyle w:val="Ttulo2"/>
       </w:pPr>
-      <w:bookmarkStart w:id="23" w:name="_Toc228530822"/>
+      <w:bookmarkStart w:id="14" w:name="_Toc228530822"/>
       <w:r>
         <w:t>Desviaciones justificadas</w:t>
       </w:r>
-      <w:bookmarkEnd w:id="23"/>
+      <w:bookmarkEnd w:id="14"/>
     </w:p>
     <w:p>
       <w:r>
@@ -2674,12 +2601,12 @@
       <w:pPr>
         <w:pStyle w:val="Ttulo1"/>
       </w:pPr>
-      <w:bookmarkStart w:id="24" w:name="_Toc228530823"/>
+      <w:bookmarkStart w:id="15" w:name="_Toc228530823"/>
       <w:r>
         <w:lastRenderedPageBreak/>
         <w:t>Reflexiones y aprendizajes</w:t>
       </w:r>
-      <w:bookmarkEnd w:id="24"/>
+      <w:bookmarkEnd w:id="15"/>
     </w:p>
     <w:p>
       <w:r>
@@ -2706,14 +2633,14 @@
       <w:pPr>
         <w:ind w:firstLine="0"/>
       </w:pPr>
-      <w:bookmarkStart w:id="25" w:name="_Toc228530824"/>
+      <w:bookmarkStart w:id="16" w:name="_Toc228530824"/>
       <w:r>
         <w:rPr>
           <w:rStyle w:val="Ttulo2Car"/>
         </w:rPr>
         <w:t>Anexo A:</w:t>
       </w:r>
-      <w:bookmarkEnd w:id="25"/>
+      <w:bookmarkEnd w:id="16"/>
       <w:r>
         <w:t xml:space="preserve"> Salida</w:t>
       </w:r>
@@ -4681,7 +4608,6 @@
   <w:style w:type="character" w:default="1" w:styleId="Fuentedeprrafopredeter">
     <w:name w:val="Default Paragraph Font"/>
     <w:uiPriority w:val="1"/>
-    <w:semiHidden/>
     <w:unhideWhenUsed/>
   </w:style>
   <w:style w:type="table" w:default="1" w:styleId="Tablanormal">

</xml_diff>